<commit_message>
capa extración, transformacion  y carga datos en Power BI, conector SQL Server MySQL, modo importacion
</commit_message>
<xml_diff>
--- a/docs/03_powerbi/informe_analisis_powerbi_yugioh.docx
+++ b/docs/03_powerbi/informe_analisis_powerbi_yugioh.docx
@@ -1883,6 +1883,400 @@
         <w:t>Los rankings, outliers y resumenes se calculan como medidas o filtros desde hechos base.</w:t>
       </w:r>
     </w:p>
+    <w:p>
+      <w:pPr>
+        <w:pStyle w:val="Heading2"/>
+      </w:pPr>
+      <w:r>
+        <w:t>4.2 Procesos aplicados para el informe Power BI</w:t>
+      </w:r>
+    </w:p>
+    <w:tbl>
+      <w:tblPr>
+        <w:tblW w:type="dxa" w:w="9360"/>
+        <w:tblLayout w:type="fixed"/>
+        <w:tblLook w:firstColumn="1" w:firstRow="1" w:lastColumn="0" w:lastRow="0" w:noHBand="0" w:noVBand="1" w:val="04A0"/>
+        <w:tblInd w:w="120" w:type="dxa"/>
+      </w:tblPr>
+      <w:tblGrid>
+        <w:gridCol w:w="3120"/>
+        <w:gridCol w:w="3120"/>
+        <w:gridCol w:w="3120"/>
+      </w:tblGrid>
+      <w:tr>
+        <w:trPr>
+          <w:tblHeader w:val="true"/>
+        </w:trPr>
+        <w:tc>
+          <w:tcPr>
+            <w:tcW w:type="dxa" w:w="2500"/>
+            <w:vAlign w:val="center"/>
+            <w:tcBorders>
+              <w:top w:val="single" w:sz="6" w:space="0" w:color="D9E2EC"/>
+              <w:left w:val="single" w:sz="6" w:space="0" w:color="D9E2EC"/>
+              <w:bottom w:val="single" w:sz="6" w:space="0" w:color="D9E2EC"/>
+              <w:right w:val="single" w:sz="6" w:space="0" w:color="D9E2EC"/>
+            </w:tcBorders>
+            <w:tcMar>
+              <w:top w:w="80" w:type="dxa"/>
+              <w:start w:w="120" w:type="dxa"/>
+              <w:bottom w:w="80" w:type="dxa"/>
+              <w:end w:w="120" w:type="dxa"/>
+            </w:tcMar>
+            <w:shd w:fill="F2F4F7"/>
+          </w:tcPr>
+          <w:p>
+            <w:r>
+              <w:rPr>
+                <w:b/>
+                <w:color w:val="1F4D78"/>
+              </w:rPr>
+              <w:t>Proceso</w:t>
+            </w:r>
+          </w:p>
+        </w:tc>
+        <w:tc>
+          <w:tcPr>
+            <w:tcW w:type="dxa" w:w="4300"/>
+            <w:vAlign w:val="center"/>
+            <w:tcBorders>
+              <w:top w:val="single" w:sz="6" w:space="0" w:color="D9E2EC"/>
+              <w:left w:val="single" w:sz="6" w:space="0" w:color="D9E2EC"/>
+              <w:bottom w:val="single" w:sz="6" w:space="0" w:color="D9E2EC"/>
+              <w:right w:val="single" w:sz="6" w:space="0" w:color="D9E2EC"/>
+            </w:tcBorders>
+            <w:tcMar>
+              <w:top w:w="80" w:type="dxa"/>
+              <w:start w:w="120" w:type="dxa"/>
+              <w:bottom w:w="80" w:type="dxa"/>
+              <w:end w:w="120" w:type="dxa"/>
+            </w:tcMar>
+            <w:shd w:fill="F2F4F7"/>
+          </w:tcPr>
+          <w:p>
+            <w:r>
+              <w:rPr>
+                <w:b/>
+                <w:color w:val="1F4D78"/>
+              </w:rPr>
+              <w:t>Aplicacion</w:t>
+            </w:r>
+          </w:p>
+        </w:tc>
+        <w:tc>
+          <w:tcPr>
+            <w:tcW w:type="dxa" w:w="2560"/>
+            <w:vAlign w:val="center"/>
+            <w:tcBorders>
+              <w:top w:val="single" w:sz="6" w:space="0" w:color="D9E2EC"/>
+              <w:left w:val="single" w:sz="6" w:space="0" w:color="D9E2EC"/>
+              <w:bottom w:val="single" w:sz="6" w:space="0" w:color="D9E2EC"/>
+              <w:right w:val="single" w:sz="6" w:space="0" w:color="D9E2EC"/>
+            </w:tcBorders>
+            <w:tcMar>
+              <w:top w:w="80" w:type="dxa"/>
+              <w:start w:w="120" w:type="dxa"/>
+              <w:bottom w:w="80" w:type="dxa"/>
+              <w:end w:w="120" w:type="dxa"/>
+            </w:tcMar>
+            <w:shd w:fill="F2F4F7"/>
+          </w:tcPr>
+          <w:p>
+            <w:r>
+              <w:rPr>
+                <w:b/>
+                <w:color w:val="1F4D78"/>
+              </w:rPr>
+              <w:t>Criterio vigente</w:t>
+            </w:r>
+          </w:p>
+        </w:tc>
+      </w:tr>
+      <w:tr>
+        <w:tc>
+          <w:tcPr>
+            <w:tcW w:type="dxa" w:w="2500"/>
+            <w:vAlign w:val="center"/>
+            <w:tcBorders>
+              <w:top w:val="single" w:sz="6" w:space="0" w:color="D9E2EC"/>
+              <w:left w:val="single" w:sz="6" w:space="0" w:color="D9E2EC"/>
+              <w:bottom w:val="single" w:sz="6" w:space="0" w:color="D9E2EC"/>
+              <w:right w:val="single" w:sz="6" w:space="0" w:color="D9E2EC"/>
+            </w:tcBorders>
+            <w:tcMar>
+              <w:top w:w="80" w:type="dxa"/>
+              <w:start w:w="120" w:type="dxa"/>
+              <w:bottom w:w="80" w:type="dxa"/>
+              <w:end w:w="120" w:type="dxa"/>
+            </w:tcMar>
+          </w:tcPr>
+          <w:p>
+            <w:r>
+              <w:t>Carga y transformacion ETL</w:t>
+            </w:r>
+          </w:p>
+        </w:tc>
+        <w:tc>
+          <w:tcPr>
+            <w:tcW w:type="dxa" w:w="4300"/>
+            <w:vAlign w:val="center"/>
+            <w:tcBorders>
+              <w:top w:val="single" w:sz="6" w:space="0" w:color="D9E2EC"/>
+              <w:left w:val="single" w:sz="6" w:space="0" w:color="D9E2EC"/>
+              <w:bottom w:val="single" w:sz="6" w:space="0" w:color="D9E2EC"/>
+              <w:right w:val="single" w:sz="6" w:space="0" w:color="D9E2EC"/>
+            </w:tcBorders>
+            <w:tcMar>
+              <w:top w:w="80" w:type="dxa"/>
+              <w:start w:w="120" w:type="dxa"/>
+              <w:bottom w:w="80" w:type="dxa"/>
+              <w:end w:w="120" w:type="dxa"/>
+            </w:tcMar>
+          </w:tcPr>
+          <w:p>
+            <w:r>
+              <w:t>Datos extraidos, transformados y cargados en MySQL desde el flujo Python.</w:t>
+            </w:r>
+          </w:p>
+        </w:tc>
+        <w:tc>
+          <w:tcPr>
+            <w:tcW w:type="dxa" w:w="2560"/>
+            <w:vAlign w:val="center"/>
+            <w:tcBorders>
+              <w:top w:val="single" w:sz="6" w:space="0" w:color="D9E2EC"/>
+              <w:left w:val="single" w:sz="6" w:space="0" w:color="D9E2EC"/>
+              <w:bottom w:val="single" w:sz="6" w:space="0" w:color="D9E2EC"/>
+              <w:right w:val="single" w:sz="6" w:space="0" w:color="D9E2EC"/>
+            </w:tcBorders>
+            <w:tcMar>
+              <w:top w:w="80" w:type="dxa"/>
+              <w:start w:w="120" w:type="dxa"/>
+              <w:bottom w:w="80" w:type="dxa"/>
+              <w:end w:w="120" w:type="dxa"/>
+            </w:tcMar>
+          </w:tcPr>
+          <w:p>
+            <w:r>
+              <w:t>Power BI consume las vistas SQL publicadas; no modifica tablas madre.</w:t>
+            </w:r>
+          </w:p>
+        </w:tc>
+      </w:tr>
+      <w:tr>
+        <w:tc>
+          <w:tcPr>
+            <w:tcW w:type="dxa" w:w="2500"/>
+            <w:vAlign w:val="center"/>
+            <w:tcBorders>
+              <w:top w:val="single" w:sz="6" w:space="0" w:color="D9E2EC"/>
+              <w:left w:val="single" w:sz="6" w:space="0" w:color="D9E2EC"/>
+              <w:bottom w:val="single" w:sz="6" w:space="0" w:color="D9E2EC"/>
+              <w:right w:val="single" w:sz="6" w:space="0" w:color="D9E2EC"/>
+            </w:tcBorders>
+            <w:tcMar>
+              <w:top w:w="80" w:type="dxa"/>
+              <w:start w:w="120" w:type="dxa"/>
+              <w:bottom w:w="80" w:type="dxa"/>
+              <w:end w:w="120" w:type="dxa"/>
+            </w:tcMar>
+          </w:tcPr>
+          <w:p>
+            <w:r>
+              <w:t>Nulos en atributos numericos de carta</w:t>
+            </w:r>
+          </w:p>
+        </w:tc>
+        <w:tc>
+          <w:tcPr>
+            <w:tcW w:type="dxa" w:w="4300"/>
+            <w:vAlign w:val="center"/>
+            <w:tcBorders>
+              <w:top w:val="single" w:sz="6" w:space="0" w:color="D9E2EC"/>
+              <w:left w:val="single" w:sz="6" w:space="0" w:color="D9E2EC"/>
+              <w:bottom w:val="single" w:sz="6" w:space="0" w:color="D9E2EC"/>
+              <w:right w:val="single" w:sz="6" w:space="0" w:color="D9E2EC"/>
+            </w:tcBorders>
+            <w:tcMar>
+              <w:top w:w="80" w:type="dxa"/>
+              <w:start w:w="120" w:type="dxa"/>
+              <w:bottom w:w="80" w:type="dxa"/>
+              <w:end w:w="120" w:type="dxa"/>
+            </w:tcMar>
+          </w:tcPr>
+          <w:p>
+            <w:r>
+              <w:t>`atk`, `def` y `link_value` se interpretan como 0 cuando no aplican; `scale` se interpreta como -1.</w:t>
+            </w:r>
+          </w:p>
+        </w:tc>
+        <w:tc>
+          <w:tcPr>
+            <w:tcW w:type="dxa" w:w="2560"/>
+            <w:vAlign w:val="center"/>
+            <w:tcBorders>
+              <w:top w:val="single" w:sz="6" w:space="0" w:color="D9E2EC"/>
+              <w:left w:val="single" w:sz="6" w:space="0" w:color="D9E2EC"/>
+              <w:bottom w:val="single" w:sz="6" w:space="0" w:color="D9E2EC"/>
+              <w:right w:val="single" w:sz="6" w:space="0" w:color="D9E2EC"/>
+            </w:tcBorders>
+            <w:tcMar>
+              <w:top w:w="80" w:type="dxa"/>
+              <w:start w:w="120" w:type="dxa"/>
+              <w:bottom w:w="80" w:type="dxa"/>
+              <w:end w:w="120" w:type="dxa"/>
+            </w:tcMar>
+          </w:tcPr>
+          <w:p>
+            <w:r>
+              <w:t>Evita mezclar nulos tecnicos con valores analizables en segmentaciones y tarjetas.</w:t>
+            </w:r>
+          </w:p>
+        </w:tc>
+      </w:tr>
+      <w:tr>
+        <w:tc>
+          <w:tcPr>
+            <w:tcW w:type="dxa" w:w="2500"/>
+            <w:vAlign w:val="center"/>
+            <w:tcBorders>
+              <w:top w:val="single" w:sz="6" w:space="0" w:color="D9E2EC"/>
+              <w:left w:val="single" w:sz="6" w:space="0" w:color="D9E2EC"/>
+              <w:bottom w:val="single" w:sz="6" w:space="0" w:color="D9E2EC"/>
+              <w:right w:val="single" w:sz="6" w:space="0" w:color="D9E2EC"/>
+            </w:tcBorders>
+            <w:tcMar>
+              <w:top w:w="80" w:type="dxa"/>
+              <w:start w:w="120" w:type="dxa"/>
+              <w:bottom w:w="80" w:type="dxa"/>
+              <w:end w:w="120" w:type="dxa"/>
+            </w:tcMar>
+          </w:tcPr>
+          <w:p>
+            <w:r>
+              <w:t>Variacion porcentual de precio</w:t>
+            </w:r>
+          </w:p>
+        </w:tc>
+        <w:tc>
+          <w:tcPr>
+            <w:tcW w:type="dxa" w:w="4300"/>
+            <w:vAlign w:val="center"/>
+            <w:tcBorders>
+              <w:top w:val="single" w:sz="6" w:space="0" w:color="D9E2EC"/>
+              <w:left w:val="single" w:sz="6" w:space="0" w:color="D9E2EC"/>
+              <w:bottom w:val="single" w:sz="6" w:space="0" w:color="D9E2EC"/>
+              <w:right w:val="single" w:sz="6" w:space="0" w:color="D9E2EC"/>
+            </w:tcBorders>
+            <w:tcMar>
+              <w:top w:w="80" w:type="dxa"/>
+              <w:start w:w="120" w:type="dxa"/>
+              <w:bottom w:w="80" w:type="dxa"/>
+              <w:end w:w="120" w:type="dxa"/>
+            </w:tcMar>
+          </w:tcPr>
+          <w:p>
+            <w:r>
+              <w:t>`vw_fact_card_price_variation_predictive.price_change_pct` conserva `NULL` cuando no hay base comparable.</w:t>
+            </w:r>
+          </w:p>
+        </w:tc>
+        <w:tc>
+          <w:tcPr>
+            <w:tcW w:type="dxa" w:w="2560"/>
+            <w:vAlign w:val="center"/>
+            <w:tcBorders>
+              <w:top w:val="single" w:sz="6" w:space="0" w:color="D9E2EC"/>
+              <w:left w:val="single" w:sz="6" w:space="0" w:color="D9E2EC"/>
+              <w:bottom w:val="single" w:sz="6" w:space="0" w:color="D9E2EC"/>
+              <w:right w:val="single" w:sz="6" w:space="0" w:color="D9E2EC"/>
+            </w:tcBorders>
+            <w:tcMar>
+              <w:top w:w="80" w:type="dxa"/>
+              <w:start w:w="120" w:type="dxa"/>
+              <w:bottom w:w="80" w:type="dxa"/>
+              <w:end w:w="120" w:type="dxa"/>
+            </w:tcMar>
+          </w:tcPr>
+          <w:p>
+            <w:r>
+              <w:t>Las metricas y visuales aplican contexto de filtro para excluir valores vacios cuando el calculo lo requiera.</w:t>
+            </w:r>
+          </w:p>
+        </w:tc>
+      </w:tr>
+      <w:tr>
+        <w:tc>
+          <w:tcPr>
+            <w:tcW w:type="dxa" w:w="2500"/>
+            <w:vAlign w:val="center"/>
+            <w:tcBorders>
+              <w:top w:val="single" w:sz="6" w:space="0" w:color="D9E2EC"/>
+              <w:left w:val="single" w:sz="6" w:space="0" w:color="D9E2EC"/>
+              <w:bottom w:val="single" w:sz="6" w:space="0" w:color="D9E2EC"/>
+              <w:right w:val="single" w:sz="6" w:space="0" w:color="D9E2EC"/>
+            </w:tcBorders>
+            <w:tcMar>
+              <w:top w:w="80" w:type="dxa"/>
+              <w:start w:w="120" w:type="dxa"/>
+              <w:bottom w:w="80" w:type="dxa"/>
+              <w:end w:w="120" w:type="dxa"/>
+            </w:tcMar>
+          </w:tcPr>
+          <w:p>
+            <w:r>
+              <w:t>Filtrado aplicado en Power BI</w:t>
+            </w:r>
+          </w:p>
+        </w:tc>
+        <w:tc>
+          <w:tcPr>
+            <w:tcW w:type="dxa" w:w="4300"/>
+            <w:vAlign w:val="center"/>
+            <w:tcBorders>
+              <w:top w:val="single" w:sz="6" w:space="0" w:color="D9E2EC"/>
+              <w:left w:val="single" w:sz="6" w:space="0" w:color="D9E2EC"/>
+              <w:bottom w:val="single" w:sz="6" w:space="0" w:color="D9E2EC"/>
+              <w:right w:val="single" w:sz="6" w:space="0" w:color="D9E2EC"/>
+            </w:tcBorders>
+            <w:tcMar>
+              <w:top w:w="80" w:type="dxa"/>
+              <w:start w:w="120" w:type="dxa"/>
+              <w:bottom w:w="80" w:type="dxa"/>
+              <w:end w:w="120" w:type="dxa"/>
+            </w:tcMar>
+          </w:tcPr>
+          <w:p>
+            <w:r>
+              <w:t>Las filas con `price_change_pct` vacio se excluyen en pasos aplicados o filtros del visual cuando se analizan variaciones.</w:t>
+            </w:r>
+          </w:p>
+        </w:tc>
+        <w:tc>
+          <w:tcPr>
+            <w:tcW w:type="dxa" w:w="2560"/>
+            <w:vAlign w:val="center"/>
+            <w:tcBorders>
+              <w:top w:val="single" w:sz="6" w:space="0" w:color="D9E2EC"/>
+              <w:left w:val="single" w:sz="6" w:space="0" w:color="D9E2EC"/>
+              <w:bottom w:val="single" w:sz="6" w:space="0" w:color="D9E2EC"/>
+              <w:right w:val="single" w:sz="6" w:space="0" w:color="D9E2EC"/>
+            </w:tcBorders>
+            <w:tcMar>
+              <w:top w:w="80" w:type="dxa"/>
+              <w:start w:w="120" w:type="dxa"/>
+              <w:bottom w:w="80" w:type="dxa"/>
+              <w:end w:w="120" w:type="dxa"/>
+            </w:tcMar>
+          </w:tcPr>
+          <w:p>
+            <w:r>
+              <w:t>La vista SQL conserva el dato original; el filtro pertenece al contexto analitico.</w:t>
+            </w:r>
+          </w:p>
+        </w:tc>
+      </w:tr>
+    </w:tbl>
     <w:p>
       <w:pPr>
         <w:pStyle w:val="Heading1"/>

</xml_diff>